<commit_message>
Group work paper: retitle section 9 as Amina's Case Study, emphasise the issues in the first Conclusion paragraph
- Section 9 heading changed to '9. Amina's Case Study'
- Bold emphasis applied to the issues named in the FIRST paragraph of the Conclusion only (awareness, present-moment experience, contact, personal responsibility, relationship between individual and environment); later conclusion paragraphs untouched
- References checked: the list contains no tick/bullet markers, so nothing was removed
- No other text, formatting or document part changed

Co-authored-by: arena-agent <297053741+arena-agent@users.noreply.github.com>
</commit_message>
<xml_diff>
--- a/GESTALT THERAPY GROUP WORK.docx
+++ b/GESTALT THERAPY GROUP WORK.docx
@@ -3790,7 +3790,7 @@
           <w:sz w:val="36"/>
           <w:szCs w:val="36"/>
         </w:rPr>
-        <w:t>9. Application of Gestalt Therapy: A Case Study</w:t>
+        <w:t>9. Amina’s Case Study</w:t>
       </w:r>
     </w:p>
     <w:p>
@@ -4854,7 +4854,97 @@
           <w:sz w:val="24"/>
           <w:szCs w:val="24"/>
         </w:rPr>
-        <w:t>Gestalt Therapy is a humanistic and experiential approach that emphasises awareness, present-moment experience, contact, personal responsibility, and the relationship between the individual and the environment. Its major concepts provide counsellors with a framework for exploring how clients experience their needs, emotions, beliefs, relationships, and choices.</w:t>
+        <w:t xml:space="preserve">Gestalt Therapy is a humanistic and experiential approach that emphasises </w:t>
+      </w:r>
+      <w:r>
+        <w:rPr>
+          <w:b/>
+          <w:bCs/>
+          <w:rFonts w:ascii="Times New Roman" w:eastAsia="Times New Roman" w:hAnsi="Times New Roman" w:cs="Times New Roman"/>
+          <w:sz w:val="24"/>
+          <w:szCs w:val="24"/>
+        </w:rPr>
+        <w:t xml:space="preserve">awareness</w:t>
+      </w:r>
+      <w:r>
+        <w:rPr>
+          <w:rFonts w:ascii="Times New Roman" w:eastAsia="Times New Roman" w:hAnsi="Times New Roman" w:cs="Times New Roman"/>
+          <w:sz w:val="24"/>
+          <w:szCs w:val="24"/>
+        </w:rPr>
+        <w:t xml:space="preserve">, </w:t>
+      </w:r>
+      <w:r>
+        <w:rPr>
+          <w:b/>
+          <w:bCs/>
+          <w:rFonts w:ascii="Times New Roman" w:eastAsia="Times New Roman" w:hAnsi="Times New Roman" w:cs="Times New Roman"/>
+          <w:sz w:val="24"/>
+          <w:szCs w:val="24"/>
+        </w:rPr>
+        <w:t xml:space="preserve">present-moment experience</w:t>
+      </w:r>
+      <w:r>
+        <w:rPr>
+          <w:rFonts w:ascii="Times New Roman" w:eastAsia="Times New Roman" w:hAnsi="Times New Roman" w:cs="Times New Roman"/>
+          <w:sz w:val="24"/>
+          <w:szCs w:val="24"/>
+        </w:rPr>
+        <w:t xml:space="preserve">, </w:t>
+      </w:r>
+      <w:r>
+        <w:rPr>
+          <w:b/>
+          <w:bCs/>
+          <w:rFonts w:ascii="Times New Roman" w:eastAsia="Times New Roman" w:hAnsi="Times New Roman" w:cs="Times New Roman"/>
+          <w:sz w:val="24"/>
+          <w:szCs w:val="24"/>
+        </w:rPr>
+        <w:t xml:space="preserve">contact</w:t>
+      </w:r>
+      <w:r>
+        <w:rPr>
+          <w:rFonts w:ascii="Times New Roman" w:eastAsia="Times New Roman" w:hAnsi="Times New Roman" w:cs="Times New Roman"/>
+          <w:sz w:val="24"/>
+          <w:szCs w:val="24"/>
+        </w:rPr>
+        <w:t xml:space="preserve">, </w:t>
+      </w:r>
+      <w:r>
+        <w:rPr>
+          <w:b/>
+          <w:bCs/>
+          <w:rFonts w:ascii="Times New Roman" w:eastAsia="Times New Roman" w:hAnsi="Times New Roman" w:cs="Times New Roman"/>
+          <w:sz w:val="24"/>
+          <w:szCs w:val="24"/>
+        </w:rPr>
+        <w:t xml:space="preserve">personal responsibility</w:t>
+      </w:r>
+      <w:r>
+        <w:rPr>
+          <w:rFonts w:ascii="Times New Roman" w:eastAsia="Times New Roman" w:hAnsi="Times New Roman" w:cs="Times New Roman"/>
+          <w:sz w:val="24"/>
+          <w:szCs w:val="24"/>
+        </w:rPr>
+        <w:t xml:space="preserve">, and </w:t>
+      </w:r>
+      <w:r>
+        <w:rPr>
+          <w:b/>
+          <w:bCs/>
+          <w:rFonts w:ascii="Times New Roman" w:eastAsia="Times New Roman" w:hAnsi="Times New Roman" w:cs="Times New Roman"/>
+          <w:sz w:val="24"/>
+          <w:szCs w:val="24"/>
+        </w:rPr>
+        <w:t xml:space="preserve">the relationship between the individual and the environment</w:t>
+      </w:r>
+      <w:r>
+        <w:rPr>
+          <w:rFonts w:ascii="Times New Roman" w:eastAsia="Times New Roman" w:hAnsi="Times New Roman" w:cs="Times New Roman"/>
+          <w:sz w:val="24"/>
+          <w:szCs w:val="24"/>
+        </w:rPr>
+        <w:t xml:space="preserve">. Its major concepts provide counsellors with a framework for exploring how clients experience their needs, emotions, beliefs, relationships, and choices.</w:t>
       </w:r>
     </w:p>
     <w:p>

</xml_diff>

<commit_message>
Deck: retitle slide 19 as Amina's Case Study, remove tick/cross marks, revert the Word file
- Slide 19 header: 'Case Application' -> "Amina's Case Study"
- Slide 11: removed the tick/cross marks before the language examples; the
  two example lines keep their existing wording, font and accent colour
- No design, layout, colour, font, image, animation or transition changes
- GESTALT THERAPY GROUP WORK.docx restored to its previous state (no edits)
- Gates: render QA 0 issues, 280/280 required phrases, 0 tick glyphs deck-wide

Co-authored-by: arena-agent <297053741+arena-agent@users.noreply.github.com>
</commit_message>
<xml_diff>
--- a/GESTALT THERAPY GROUP WORK.docx
+++ b/GESTALT THERAPY GROUP WORK.docx
@@ -3790,7 +3790,7 @@
           <w:sz w:val="36"/>
           <w:szCs w:val="36"/>
         </w:rPr>
-        <w:t>9. Amina’s Case Study</w:t>
+        <w:t>9. Application of Gestalt Therapy: A Case Study</w:t>
       </w:r>
     </w:p>
     <w:p>
@@ -4854,97 +4854,7 @@
           <w:sz w:val="24"/>
           <w:szCs w:val="24"/>
         </w:rPr>
-        <w:t xml:space="preserve">Gestalt Therapy is a humanistic and experiential approach that emphasises </w:t>
-      </w:r>
-      <w:r>
-        <w:rPr>
-          <w:b/>
-          <w:bCs/>
-          <w:rFonts w:ascii="Times New Roman" w:eastAsia="Times New Roman" w:hAnsi="Times New Roman" w:cs="Times New Roman"/>
-          <w:sz w:val="24"/>
-          <w:szCs w:val="24"/>
-        </w:rPr>
-        <w:t xml:space="preserve">awareness</w:t>
-      </w:r>
-      <w:r>
-        <w:rPr>
-          <w:rFonts w:ascii="Times New Roman" w:eastAsia="Times New Roman" w:hAnsi="Times New Roman" w:cs="Times New Roman"/>
-          <w:sz w:val="24"/>
-          <w:szCs w:val="24"/>
-        </w:rPr>
-        <w:t xml:space="preserve">, </w:t>
-      </w:r>
-      <w:r>
-        <w:rPr>
-          <w:b/>
-          <w:bCs/>
-          <w:rFonts w:ascii="Times New Roman" w:eastAsia="Times New Roman" w:hAnsi="Times New Roman" w:cs="Times New Roman"/>
-          <w:sz w:val="24"/>
-          <w:szCs w:val="24"/>
-        </w:rPr>
-        <w:t xml:space="preserve">present-moment experience</w:t>
-      </w:r>
-      <w:r>
-        <w:rPr>
-          <w:rFonts w:ascii="Times New Roman" w:eastAsia="Times New Roman" w:hAnsi="Times New Roman" w:cs="Times New Roman"/>
-          <w:sz w:val="24"/>
-          <w:szCs w:val="24"/>
-        </w:rPr>
-        <w:t xml:space="preserve">, </w:t>
-      </w:r>
-      <w:r>
-        <w:rPr>
-          <w:b/>
-          <w:bCs/>
-          <w:rFonts w:ascii="Times New Roman" w:eastAsia="Times New Roman" w:hAnsi="Times New Roman" w:cs="Times New Roman"/>
-          <w:sz w:val="24"/>
-          <w:szCs w:val="24"/>
-        </w:rPr>
-        <w:t xml:space="preserve">contact</w:t>
-      </w:r>
-      <w:r>
-        <w:rPr>
-          <w:rFonts w:ascii="Times New Roman" w:eastAsia="Times New Roman" w:hAnsi="Times New Roman" w:cs="Times New Roman"/>
-          <w:sz w:val="24"/>
-          <w:szCs w:val="24"/>
-        </w:rPr>
-        <w:t xml:space="preserve">, </w:t>
-      </w:r>
-      <w:r>
-        <w:rPr>
-          <w:b/>
-          <w:bCs/>
-          <w:rFonts w:ascii="Times New Roman" w:eastAsia="Times New Roman" w:hAnsi="Times New Roman" w:cs="Times New Roman"/>
-          <w:sz w:val="24"/>
-          <w:szCs w:val="24"/>
-        </w:rPr>
-        <w:t xml:space="preserve">personal responsibility</w:t>
-      </w:r>
-      <w:r>
-        <w:rPr>
-          <w:rFonts w:ascii="Times New Roman" w:eastAsia="Times New Roman" w:hAnsi="Times New Roman" w:cs="Times New Roman"/>
-          <w:sz w:val="24"/>
-          <w:szCs w:val="24"/>
-        </w:rPr>
-        <w:t xml:space="preserve">, and </w:t>
-      </w:r>
-      <w:r>
-        <w:rPr>
-          <w:b/>
-          <w:bCs/>
-          <w:rFonts w:ascii="Times New Roman" w:eastAsia="Times New Roman" w:hAnsi="Times New Roman" w:cs="Times New Roman"/>
-          <w:sz w:val="24"/>
-          <w:szCs w:val="24"/>
-        </w:rPr>
-        <w:t xml:space="preserve">the relationship between the individual and the environment</w:t>
-      </w:r>
-      <w:r>
-        <w:rPr>
-          <w:rFonts w:ascii="Times New Roman" w:eastAsia="Times New Roman" w:hAnsi="Times New Roman" w:cs="Times New Roman"/>
-          <w:sz w:val="24"/>
-          <w:szCs w:val="24"/>
-        </w:rPr>
-        <w:t xml:space="preserve">. Its major concepts provide counsellors with a framework for exploring how clients experience their needs, emotions, beliefs, relationships, and choices.</w:t>
+        <w:t>Gestalt Therapy is a humanistic and experiential approach that emphasises awareness, present-moment experience, contact, personal responsibility, and the relationship between the individual and the environment. Its major concepts provide counsellors with a framework for exploring how clients experience their needs, emotions, beliefs, relationships, and choices.</w:t>
       </w:r>
     </w:p>
     <w:p>

</xml_diff>